<commit_message>
Reading order fixes (units not sessions, correct next pointers, perplexity and softmax defined where first used), mobile header and widget menu, dark-mode contrast
Co-Authored-By: Claude Sonnet 5.5 <noreply@anthropic.com>
</commit_message>
<xml_diff>
--- a/downloads/u1/u1-notes.docx
+++ b/downloads/u1/u1-notes.docx
@@ -15,7 +15,7 @@
         <w:pStyle w:val="Subtitle"/>
       </w:pPr>
       <w:r>
-        <w:t xml:space="preserve">Unit 1 of the Generative AI and LLM crash course · session 003 · curriculum node U1</w:t>
+        <w:t xml:space="preserve">Unit 1 of the Generative AI and LLM crash course</w:t>
       </w:r>
     </w:p>
     <w:p>
@@ -315,7 +315,7 @@
         <w:t xml:space="preserve"> </w:t>
       </w:r>
       <w:r>
-        <w:t xml:space="preserve">Bayes’ rule, expectation, the logarithm; gradient descent; the idea of a neural-network layer. Session 001 (Unit 3) defined perplexity and next-token prediction, which are used here; session 002 (Unit 2) built the Transformer, which is only</w:t>
+        <w:t xml:space="preserve">Bayes’ rule, expectation, the logarithm; gradient descent; the idea of a neural-network layer. Perplexity and next-token prediction are defined in Section 2 below and taken up in depth in Unit 3; the Transformer (Unit 2) is only</w:t>
       </w:r>
       <w:r>
         <w:t xml:space="preserve"> </w:t>
@@ -1635,6 +1635,86 @@
               <w:jc w:val="left"/>
             </w:pPr>
             <w:r>
+              <w:t xml:space="preserve">perplexity</w:t>
+            </w:r>
+          </w:p>
+        </w:tc>
+        <w:tc>
+          <w:tcPr/>
+          <w:p>
+            <w:pPr>
+              <w:pStyle w:val="Compact"/>
+              <w:jc w:val="center"/>
+            </w:pPr>
+            <w:r>
+              <w:t xml:space="preserve">PPL</w:t>
+            </w:r>
+          </w:p>
+        </w:tc>
+        <w:tc>
+          <w:tcPr/>
+          <w:p>
+            <w:pPr>
+              <w:pStyle w:val="Compact"/>
+              <w:jc w:val="left"/>
+            </w:pPr>
+            <m:oMath>
+              <m:sSup>
+                <m:e>
+                  <m:r>
+                    <m:t>e</m:t>
+                  </m:r>
+                </m:e>
+                <m:sup>
+                  <m:r>
+                    <m:rPr>
+                      <m:nor/>
+                      <m:sty m:val="p"/>
+                    </m:rPr>
+                    <m:t>cross-entropy</m:t>
+                  </m:r>
+                </m:sup>
+              </m:sSup>
+            </m:oMath>
+            <w:r>
+              <w:t xml:space="preserve">: the effective number of equally likely choices</w:t>
+            </w:r>
+          </w:p>
+        </w:tc>
+        <w:tc>
+          <w:tcPr/>
+          <w:p>
+            <w:pPr>
+              <w:pStyle w:val="Compact"/>
+              <w:jc w:val="left"/>
+            </w:pPr>
+            <w:r>
+              <w:t xml:space="preserve">2</w:t>
+            </w:r>
+          </w:p>
+        </w:tc>
+        <w:tc>
+          <w:tcPr/>
+          <w:p>
+            <w:pPr>
+              <w:pStyle w:val="Compact"/>
+              <w:jc w:val="center"/>
+            </w:pPr>
+            <w:r>
+              <w:t xml:space="preserve">new</w:t>
+            </w:r>
+          </w:p>
+        </w:tc>
+      </w:tr>
+      <w:tr>
+        <w:tc>
+          <w:tcPr/>
+          <w:p>
+            <w:pPr>
+              <w:pStyle w:val="Compact"/>
+              <w:jc w:val="left"/>
+            </w:pPr>
+            <w:r>
               <w:t xml:space="preserve">overfitting / memorisation</w:t>
             </w:r>
           </w:p>
@@ -1703,7 +1783,7 @@
         <w:t xml:space="preserve">used but not taught here</w:t>
       </w:r>
       <w:r>
-        <w:t xml:space="preserve">: attention and the Transformer block (Unit 2, session 002); tokenization and decoding (Unit 3, session 001); the full diffusion derivation (Unit 7).</w:t>
+        <w:t xml:space="preserve">: attention and the Transformer block (Unit 2); tokenization and decoding (Unit 3); the full diffusion derivation (Unit 7).</w:t>
       </w:r>
     </w:p>
     <w:bookmarkEnd w:id="10"/>
@@ -2684,6 +2764,531 @@
     </w:tbl>
     <w:p>
       <w:pPr>
+        <w:pStyle w:val="Box-definition"/>
+      </w:pPr>
+      <w:r>
+        <w:rPr>
+          <w:b/>
+          <w:bCs/>
+        </w:rPr>
+        <w:t xml:space="preserve">Perplexity (used from Section 3.2.2 on)</w:t>
+      </w:r>
+    </w:p>
+    <w:p>
+      <w:pPr>
+        <w:pStyle w:val="Box-definition"/>
+      </w:pPr>
+      <w:r>
+        <w:t xml:space="preserve">Suppose a model gives the true next symbols of a text the probabilities</w:t>
+      </w:r>
+      <w:r>
+        <w:t xml:space="preserve"> </w:t>
+      </w:r>
+      <m:oMath>
+        <m:sSub>
+          <m:e>
+            <m:r>
+              <m:t>p</m:t>
+            </m:r>
+          </m:e>
+          <m:sub>
+            <m:r>
+              <m:t>1</m:t>
+            </m:r>
+          </m:sub>
+        </m:sSub>
+        <m:r>
+          <m:rPr>
+            <m:sty m:val="p"/>
+          </m:rPr>
+          <m:t>,</m:t>
+        </m:r>
+        <m:r>
+          <m:rPr>
+            <m:sty m:val="p"/>
+          </m:rPr>
+          <m:t>…</m:t>
+        </m:r>
+        <m:r>
+          <m:rPr>
+            <m:sty m:val="p"/>
+          </m:rPr>
+          <m:t>,</m:t>
+        </m:r>
+        <m:sSub>
+          <m:e>
+            <m:r>
+              <m:t>p</m:t>
+            </m:r>
+          </m:e>
+          <m:sub>
+            <m:r>
+              <m:t>n</m:t>
+            </m:r>
+          </m:sub>
+        </m:sSub>
+      </m:oMath>
+      <w:r>
+        <w:t xml:space="preserve">. Its</w:t>
+      </w:r>
+      <w:r>
+        <w:t xml:space="preserve"> </w:t>
+      </w:r>
+      <w:r>
+        <w:rPr>
+          <w:b/>
+          <w:bCs/>
+        </w:rPr>
+        <w:t xml:space="preserve">cross-entropy</w:t>
+      </w:r>
+      <w:r>
+        <w:t xml:space="preserve"> </w:t>
+      </w:r>
+      <w:r>
+        <w:t xml:space="preserve">is the average surprise</w:t>
+      </w:r>
+      <w:r>
+        <w:t xml:space="preserve"> </w:t>
+      </w:r>
+      <m:oMath>
+        <m:r>
+          <m:rPr>
+            <m:sty m:val="p"/>
+          </m:rPr>
+          <m:t>−</m:t>
+        </m:r>
+        <m:f>
+          <m:fPr>
+            <m:type m:val="bar"/>
+          </m:fPr>
+          <m:num>
+            <m:r>
+              <m:t>1</m:t>
+            </m:r>
+          </m:num>
+          <m:den>
+            <m:r>
+              <m:t>n</m:t>
+            </m:r>
+          </m:den>
+        </m:f>
+        <m:nary>
+          <m:naryPr>
+            <m:chr m:val="∑"/>
+            <m:limLoc m:val="undOvr"/>
+            <m:subHide m:val="off"/>
+            <m:supHide m:val="on"/>
+          </m:naryPr>
+          <m:sub>
+            <m:r>
+              <m:t>i</m:t>
+            </m:r>
+          </m:sub>
+          <m:sup>
+            <m:r>
+              <m:t>​</m:t>
+            </m:r>
+          </m:sup>
+          <m:e>
+            <m:r>
+              <m:rPr>
+                <m:sty m:val="p"/>
+              </m:rPr>
+              <m:t>ln</m:t>
+            </m:r>
+          </m:e>
+        </m:nary>
+        <m:sSub>
+          <m:e>
+            <m:r>
+              <m:t>p</m:t>
+            </m:r>
+          </m:e>
+          <m:sub>
+            <m:r>
+              <m:t>i</m:t>
+            </m:r>
+          </m:sub>
+        </m:sSub>
+      </m:oMath>
+      <w:r>
+        <w:t xml:space="preserve"> </w:t>
+      </w:r>
+      <w:r>
+        <w:t xml:space="preserve">(in nats), and its</w:t>
+      </w:r>
+      <w:r>
+        <w:t xml:space="preserve"> </w:t>
+      </w:r>
+      <w:r>
+        <w:rPr>
+          <w:b/>
+          <w:bCs/>
+        </w:rPr>
+        <w:t xml:space="preserve">perplexity</w:t>
+      </w:r>
+      <w:r>
+        <w:t xml:space="preserve"> </w:t>
+      </w:r>
+      <w:r>
+        <w:t xml:space="preserve">is</w:t>
+      </w:r>
+      <w:r>
+        <w:t xml:space="preserve"> </w:t>
+      </w:r>
+      <m:oMath>
+        <m:r>
+          <m:rPr>
+            <m:sty m:val="p"/>
+          </m:rPr>
+          <m:t>P</m:t>
+        </m:r>
+        <m:r>
+          <m:rPr>
+            <m:sty m:val="p"/>
+          </m:rPr>
+          <m:t>P</m:t>
+        </m:r>
+        <m:r>
+          <m:rPr>
+            <m:sty m:val="p"/>
+          </m:rPr>
+          <m:t>L</m:t>
+        </m:r>
+        <m:r>
+          <m:rPr>
+            <m:sty m:val="p"/>
+          </m:rPr>
+          <m:t>=</m:t>
+        </m:r>
+        <m:sSup>
+          <m:e>
+            <m:r>
+              <m:t>e</m:t>
+            </m:r>
+          </m:e>
+          <m:sup>
+            <m:r>
+              <m:rPr>
+                <m:nor/>
+                <m:sty m:val="p"/>
+              </m:rPr>
+              <m:t>cross-entropy</m:t>
+            </m:r>
+          </m:sup>
+        </m:sSup>
+      </m:oMath>
+      <w:r>
+        <w:t xml:space="preserve">: the number of equally likely choices the model is, on average, torn between. Guessing uniformly among</w:t>
+      </w:r>
+      <w:r>
+        <w:t xml:space="preserve"> </w:t>
+      </w:r>
+      <m:oMath>
+        <m:r>
+          <m:t>V</m:t>
+        </m:r>
+      </m:oMath>
+      <w:r>
+        <w:t xml:space="preserve"> </w:t>
+      </w:r>
+      <w:r>
+        <w:t xml:space="preserve">symbols gives</w:t>
+      </w:r>
+      <w:r>
+        <w:t xml:space="preserve"> </w:t>
+      </w:r>
+      <m:oMath>
+        <m:r>
+          <m:rPr>
+            <m:sty m:val="p"/>
+          </m:rPr>
+          <m:t>P</m:t>
+        </m:r>
+        <m:r>
+          <m:rPr>
+            <m:sty m:val="p"/>
+          </m:rPr>
+          <m:t>P</m:t>
+        </m:r>
+        <m:r>
+          <m:rPr>
+            <m:sty m:val="p"/>
+          </m:rPr>
+          <m:t>L</m:t>
+        </m:r>
+        <m:r>
+          <m:rPr>
+            <m:sty m:val="p"/>
+          </m:rPr>
+          <m:t>=</m:t>
+        </m:r>
+        <m:r>
+          <m:t>V</m:t>
+        </m:r>
+      </m:oMath>
+      <w:r>
+        <w:t xml:space="preserve">; a perfect model gives 1;</w:t>
+      </w:r>
+      <w:r>
+        <w:t xml:space="preserve"> </w:t>
+      </w:r>
+      <w:r>
+        <w:rPr>
+          <w:b/>
+          <w:bCs/>
+        </w:rPr>
+        <w:t xml:space="preserve">lower is better</w:t>
+      </w:r>
+      <w:r>
+        <w:t xml:space="preserve">. Worked example: probabilities</w:t>
+      </w:r>
+      <w:r>
+        <w:t xml:space="preserve"> </w:t>
+      </w:r>
+      <m:oMath>
+        <m:r>
+          <m:t>0.5</m:t>
+        </m:r>
+        <m:r>
+          <m:rPr>
+            <m:sty m:val="p"/>
+          </m:rPr>
+          <m:t>,</m:t>
+        </m:r>
+        <m:r>
+          <m:t> </m:t>
+        </m:r>
+        <m:r>
+          <m:t>0.25</m:t>
+        </m:r>
+        <m:r>
+          <m:rPr>
+            <m:sty m:val="p"/>
+          </m:rPr>
+          <m:t>,</m:t>
+        </m:r>
+        <m:r>
+          <m:t> </m:t>
+        </m:r>
+        <m:r>
+          <m:t>0.125</m:t>
+        </m:r>
+        <m:r>
+          <m:rPr>
+            <m:sty m:val="p"/>
+          </m:rPr>
+          <m:t>,</m:t>
+        </m:r>
+        <m:r>
+          <m:t> </m:t>
+        </m:r>
+        <m:r>
+          <m:t>0.5</m:t>
+        </m:r>
+      </m:oMath>
+      <w:r>
+        <w:t xml:space="preserve"> </w:t>
+      </w:r>
+      <w:r>
+        <w:t xml:space="preserve">give cross-entropy</w:t>
+      </w:r>
+      <w:r>
+        <w:t xml:space="preserve"> </w:t>
+      </w:r>
+      <m:oMath>
+        <m:f>
+          <m:fPr>
+            <m:type m:val="lin"/>
+          </m:fPr>
+          <m:num>
+            <m:r>
+              <m:t>1</m:t>
+            </m:r>
+          </m:num>
+          <m:den>
+            <m:r>
+              <m:t>4</m:t>
+            </m:r>
+          </m:den>
+        </m:f>
+        <m:r>
+          <m:rPr>
+            <m:sty m:val="p"/>
+          </m:rPr>
+          <m:t>(</m:t>
+        </m:r>
+        <m:r>
+          <m:rPr>
+            <m:sty m:val="p"/>
+          </m:rPr>
+          <m:t>ln</m:t>
+        </m:r>
+        <m:r>
+          <m:t>2</m:t>
+        </m:r>
+        <m:r>
+          <m:rPr>
+            <m:sty m:val="p"/>
+          </m:rPr>
+          <m:t>+</m:t>
+        </m:r>
+        <m:r>
+          <m:rPr>
+            <m:sty m:val="p"/>
+          </m:rPr>
+          <m:t>ln</m:t>
+        </m:r>
+        <m:r>
+          <m:t>4</m:t>
+        </m:r>
+        <m:r>
+          <m:rPr>
+            <m:sty m:val="p"/>
+          </m:rPr>
+          <m:t>+</m:t>
+        </m:r>
+        <m:r>
+          <m:rPr>
+            <m:sty m:val="p"/>
+          </m:rPr>
+          <m:t>ln</m:t>
+        </m:r>
+        <m:r>
+          <m:t>8</m:t>
+        </m:r>
+        <m:r>
+          <m:rPr>
+            <m:sty m:val="p"/>
+          </m:rPr>
+          <m:t>+</m:t>
+        </m:r>
+        <m:r>
+          <m:rPr>
+            <m:sty m:val="p"/>
+          </m:rPr>
+          <m:t>ln</m:t>
+        </m:r>
+        <m:r>
+          <m:t>2</m:t>
+        </m:r>
+        <m:r>
+          <m:rPr>
+            <m:sty m:val="p"/>
+          </m:rPr>
+          <m:t>)</m:t>
+        </m:r>
+        <m:r>
+          <m:rPr>
+            <m:sty m:val="p"/>
+          </m:rPr>
+          <m:t>=</m:t>
+        </m:r>
+        <m:f>
+          <m:fPr>
+            <m:type m:val="lin"/>
+          </m:fPr>
+          <m:num>
+            <m:r>
+              <m:t>1</m:t>
+            </m:r>
+          </m:num>
+          <m:den>
+            <m:r>
+              <m:t>4</m:t>
+            </m:r>
+          </m:den>
+        </m:f>
+        <m:r>
+          <m:rPr>
+            <m:sty m:val="p"/>
+          </m:rPr>
+          <m:t>ln</m:t>
+        </m:r>
+        <m:r>
+          <m:t>128</m:t>
+        </m:r>
+        <m:r>
+          <m:rPr>
+            <m:sty m:val="p"/>
+          </m:rPr>
+          <m:t>=</m:t>
+        </m:r>
+        <m:r>
+          <m:t>1.213</m:t>
+        </m:r>
+      </m:oMath>
+      <w:r>
+        <w:t xml:space="preserve"> </w:t>
+      </w:r>
+      <w:r>
+        <w:t xml:space="preserve">and</w:t>
+      </w:r>
+      <w:r>
+        <w:t xml:space="preserve"> </w:t>
+      </w:r>
+      <m:oMath>
+        <m:r>
+          <m:rPr>
+            <m:sty m:val="p"/>
+          </m:rPr>
+          <m:t>P</m:t>
+        </m:r>
+        <m:r>
+          <m:rPr>
+            <m:sty m:val="p"/>
+          </m:rPr>
+          <m:t>P</m:t>
+        </m:r>
+        <m:r>
+          <m:rPr>
+            <m:sty m:val="p"/>
+          </m:rPr>
+          <m:t>L</m:t>
+        </m:r>
+        <m:r>
+          <m:rPr>
+            <m:sty m:val="p"/>
+          </m:rPr>
+          <m:t>=</m:t>
+        </m:r>
+        <m:sSup>
+          <m:e>
+            <m:r>
+              <m:t>128</m:t>
+            </m:r>
+          </m:e>
+          <m:sup>
+            <m:r>
+              <m:t>1</m:t>
+            </m:r>
+            <m:r>
+              <m:rPr>
+                <m:sty m:val="p"/>
+              </m:rPr>
+              <m:t>/</m:t>
+            </m:r>
+            <m:r>
+              <m:t>4</m:t>
+            </m:r>
+          </m:sup>
+        </m:sSup>
+        <m:r>
+          <m:rPr>
+            <m:sty m:val="p"/>
+          </m:rPr>
+          <m:t>=</m:t>
+        </m:r>
+        <m:r>
+          <m:t>3.36</m:t>
+        </m:r>
+      </m:oMath>
+      <w:r>
+        <w:t xml:space="preserve">.</w:t>
+      </w:r>
+    </w:p>
+    <w:p>
+      <w:pPr>
         <w:pStyle w:val="BodyText"/>
       </w:pPr>
       <w:r>
@@ -3719,7 +4324,7 @@
         <w:pStyle w:val="FirstParagraph"/>
       </w:pPr>
       <w:r>
-        <w:t xml:space="preserve">the same equation as in Unit 3. Each factor is a distribution over</w:t>
+        <w:t xml:space="preserve">the equation on which every language model in Unit 3 is built. Each factor is a distribution over</w:t>
       </w:r>
       <w:r>
         <w:t xml:space="preserve"> </w:t>
@@ -16062,7 +16667,7 @@
         <w:t xml:space="preserve"> </w:t>
       </w:r>
       <w:r>
-        <w:t xml:space="preserve">model using the BPE tokenizer of session 001 and compare perplexities.</w:t>
+        <w:t xml:space="preserve">model using the BPE tokenizer of Unit 3 and compare perplexities.</w:t>
       </w:r>
     </w:p>
     <w:p>
@@ -18108,13 +18713,13 @@
           <w:b/>
           <w:bCs/>
         </w:rPr>
-        <w:t xml:space="preserve">Next node:</w:t>
-      </w:r>
-      <w:r>
-        <w:t xml:space="preserve"> </w:t>
-      </w:r>
-      <w:r>
-        <w:t xml:space="preserve">Unit 4 (prompt engineering and LLM applications), which uses the decoding settings from session 001 and the model built in session 002.</w:t>
+        <w:t xml:space="preserve">Next:</w:t>
+      </w:r>
+      <w:r>
+        <w:t xml:space="preserve"> </w:t>
+      </w:r>
+      <w:r>
+        <w:t xml:space="preserve">Unit 2 (neural networks and the Transformer), which opens up the network inside an autoregressive model; Unit 3 then covers tokens, decoding and scaling.</w:t>
       </w:r>
     </w:p>
     <w:p>

</xml_diff>

<commit_message>
Fix literal thousands separators and overfull equations/tables in PDFs
Co-Authored-By: Claude Sonnet 5.5 <noreply@anthropic.com>
</commit_message>
<xml_diff>
--- a/downloads/u1/u1-notes.docx
+++ b/downloads/u1/u1-notes.docx
@@ -565,11 +565,11 @@
         <w:tblLook w:firstRow="1" w:lastRow="0" w:firstColumn="0" w:lastColumn="0" w:noHBand="0" w:noVBand="0" w:val="0020"/>
       </w:tblPr>
       <w:tblGrid>
-        <w:gridCol w:w="754"/>
-        <w:gridCol w:w="1005"/>
-        <w:gridCol w:w="2262"/>
-        <w:gridCol w:w="2262"/>
-        <w:gridCol w:w="1634"/>
+        <w:gridCol w:w="1819"/>
+        <w:gridCol w:w="1177"/>
+        <w:gridCol w:w="2996"/>
+        <w:gridCol w:w="1070"/>
+        <w:gridCol w:w="856"/>
       </w:tblGrid>
       <w:tr>
         <w:trPr>
@@ -616,7 +616,7 @@
           <w:p>
             <w:pPr>
               <w:pStyle w:val="Compact"/>
-              <w:jc w:val="left"/>
+              <w:jc w:val="center"/>
             </w:pPr>
             <w:r>
               <w:t xml:space="preserve">Where it appears</w:t>
@@ -704,7 +704,7 @@
           <w:p>
             <w:pPr>
               <w:pStyle w:val="Compact"/>
-              <w:jc w:val="left"/>
+              <w:jc w:val="center"/>
             </w:pPr>
             <w:r>
               <w:t xml:space="preserve">3.1</w:t>
@@ -783,7 +783,7 @@
           <w:p>
             <w:pPr>
               <w:pStyle w:val="Compact"/>
-              <w:jc w:val="left"/>
+              <w:jc w:val="center"/>
             </w:pPr>
             <w:r>
               <w:t xml:space="preserve">3.1</w:t>
@@ -871,7 +871,7 @@
           <w:p>
             <w:pPr>
               <w:pStyle w:val="Compact"/>
-              <w:jc w:val="left"/>
+              <w:jc w:val="center"/>
             </w:pPr>
             <w:r>
               <w:t xml:space="preserve">3.2</w:t>
@@ -929,7 +929,7 @@
           <w:p>
             <w:pPr>
               <w:pStyle w:val="Compact"/>
-              <w:jc w:val="left"/>
+              <w:jc w:val="center"/>
             </w:pPr>
             <w:r>
               <w:t xml:space="preserve">3.2</w:t>
@@ -1015,7 +1015,7 @@
           <w:p>
             <w:pPr>
               <w:pStyle w:val="Compact"/>
-              <w:jc w:val="left"/>
+              <w:jc w:val="center"/>
             </w:pPr>
             <w:r>
               <w:t xml:space="preserve">3.2</w:t>
@@ -1073,7 +1073,7 @@
           <w:p>
             <w:pPr>
               <w:pStyle w:val="Compact"/>
-              <w:jc w:val="left"/>
+              <w:jc w:val="center"/>
             </w:pPr>
             <w:r>
               <w:t xml:space="preserve">3.2</w:t>
@@ -1137,7 +1137,7 @@
           <w:p>
             <w:pPr>
               <w:pStyle w:val="Compact"/>
-              <w:jc w:val="left"/>
+              <w:jc w:val="center"/>
             </w:pPr>
             <w:r>
               <w:t xml:space="preserve">3.2</w:t>
@@ -1195,7 +1195,7 @@
           <w:p>
             <w:pPr>
               <w:pStyle w:val="Compact"/>
-              <w:jc w:val="left"/>
+              <w:jc w:val="center"/>
             </w:pPr>
             <w:r>
               <w:t xml:space="preserve">3.3</w:t>
@@ -1263,7 +1263,7 @@
           <w:p>
             <w:pPr>
               <w:pStyle w:val="Compact"/>
-              <w:jc w:val="left"/>
+              <w:jc w:val="center"/>
             </w:pPr>
             <w:r>
               <w:t xml:space="preserve">3.3</w:t>
@@ -1339,7 +1339,7 @@
           <w:p>
             <w:pPr>
               <w:pStyle w:val="Compact"/>
-              <w:jc w:val="left"/>
+              <w:jc w:val="center"/>
             </w:pPr>
             <w:r>
               <w:t xml:space="preserve">3.3</w:t>
@@ -1432,7 +1432,7 @@
           <w:p>
             <w:pPr>
               <w:pStyle w:val="Compact"/>
-              <w:jc w:val="left"/>
+              <w:jc w:val="center"/>
             </w:pPr>
             <w:r>
               <w:t xml:space="preserve">3.3</w:t>
@@ -1490,7 +1490,7 @@
           <w:p>
             <w:pPr>
               <w:pStyle w:val="Compact"/>
-              <w:jc w:val="left"/>
+              <w:jc w:val="center"/>
             </w:pPr>
             <w:r>
               <w:t xml:space="preserve">3.3</w:t>
@@ -1548,7 +1548,7 @@
           <w:p>
             <w:pPr>
               <w:pStyle w:val="Compact"/>
-              <w:jc w:val="left"/>
+              <w:jc w:val="center"/>
             </w:pPr>
             <w:r>
               <w:t xml:space="preserve">3.3</w:t>
@@ -1606,7 +1606,7 @@
           <w:p>
             <w:pPr>
               <w:pStyle w:val="Compact"/>
-              <w:jc w:val="left"/>
+              <w:jc w:val="center"/>
             </w:pPr>
             <w:r>
               <w:t xml:space="preserve">3.3</w:t>
@@ -1686,7 +1686,7 @@
           <w:p>
             <w:pPr>
               <w:pStyle w:val="Compact"/>
-              <w:jc w:val="left"/>
+              <w:jc w:val="center"/>
             </w:pPr>
             <w:r>
               <w:t xml:space="preserve">2</w:t>
@@ -1744,7 +1744,7 @@
           <w:p>
             <w:pPr>
               <w:pStyle w:val="Compact"/>
-              <w:jc w:val="left"/>
+              <w:jc w:val="center"/>
             </w:pPr>
             <w:r>
               <w:t xml:space="preserve">3.4</w:t>
@@ -4744,7 +4744,7 @@
         <w:t xml:space="preserve"> </w:t>
       </w:r>
       <w:r>
-        <w:t xml:space="preserve">has 40 lines. Trained on the course syllabus (6{,}941 letters and spaces, 27 distinct characters, first 80% for training), it generates:</w:t>
+        <w:t xml:space="preserve">has 40 lines. Trained on the course syllabus (6,941 letters and spaces, 27 distinct characters, first 80% for training), it generates:</w:t>
       </w:r>
     </w:p>
     <w:p>
@@ -16200,28 +16200,7 @@
         </w:numPr>
       </w:pPr>
       <w:r>
-        <w:rPr>
-          <w:rStyle w:val="VerbatimChar"/>
-        </w:rPr>
-        <w:t xml:space="preserve">test_mlp_backprop_matches_finite_differences</w:t>
-      </w:r>
-      <w:r>
-        <w:t xml:space="preserve"> </w:t>
-      </w:r>
-      <w:r>
-        <w:t xml:space="preserve">and</w:t>
-      </w:r>
-      <w:r>
-        <w:t xml:space="preserve"> </w:t>
-      </w:r>
-      <w:r>
-        <w:rPr>
-          <w:rStyle w:val="VerbatimChar"/>
-        </w:rPr>
-        <w:t xml:space="preserve">test_vae_loss_gradients_match_finite_differences</w:t>
-      </w:r>
-      <w:r>
-        <w:t xml:space="preserve">: hand-written backpropagation agrees with numerical differentiation to relative error</w:t>
+        <w:t xml:space="preserve">The two gradient-check tests (one for the network, one for the VAE loss): hand-written backpropagation agrees with numerical differentiation to relative error</w:t>
       </w:r>
       <w:r>
         <w:t xml:space="preserve"> </w:t>
@@ -16333,37 +16312,18 @@
         </w:numPr>
       </w:pPr>
       <w:r>
-        <w:rPr>
-          <w:rStyle w:val="VerbatimChar"/>
-        </w:rPr>
-        <w:t xml:space="preserve">test_autoencoder_beats_pca_on_a_curve</w:t>
-      </w:r>
-      <w:r>
-        <w:t xml:space="preserve">,</w:t>
-      </w:r>
-      <w:r>
-        <w:t xml:space="preserve"> </w:t>
-      </w:r>
-      <w:r>
-        <w:rPr>
-          <w:rStyle w:val="VerbatimChar"/>
-        </w:rPr>
-        <w:t xml:space="preserve">test_gan_moves_toward_the_real_mean</w:t>
-      </w:r>
-      <w:r>
-        <w:t xml:space="preserve">,</w:t>
-      </w:r>
-      <w:r>
-        <w:t xml:space="preserve"> </w:t>
-      </w:r>
-      <w:r>
-        <w:rPr>
-          <w:rStyle w:val="VerbatimChar"/>
-        </w:rPr>
-        <w:t xml:space="preserve">test_ngram_prob_sums_to_one_and_train_perplexity_falls_with_order</w:t>
-      </w:r>
-      <w:r>
-        <w:t xml:space="preserve">: the behaviours described above hold.</w:t>
+        <w:t xml:space="preserve">The tests on the autoencoder (it beats PCA on a curve), the GAN (it moves toward the real mean) and the</w:t>
+      </w:r>
+      <w:r>
+        <w:t xml:space="preserve"> </w:t>
+      </w:r>
+      <m:oMath>
+        <m:r>
+          <m:t>n</m:t>
+        </m:r>
+      </m:oMath>
+      <w:r>
+        <w:t xml:space="preserve">-gram model (probabilities sum to one; training perplexity falls with the order): the behaviours described above hold.</w:t>
       </w:r>
     </w:p>
     <w:bookmarkEnd w:id="48"/>

</xml_diff>